<commit_message>
TS 1.6 Tamil Ghanam and Jatai
</commit_message>
<xml_diff>
--- a/TS Jatai Ghanam Project/TS 1.6/TS 1.6 Jatai Tamil Corrections.docx
+++ b/TS Jatai Ghanam Project/TS 1.6/TS 1.6 Jatai Tamil Corrections.docx
@@ -70,10 +70,9 @@
           <w:bCs/>
           <w:sz w:val="32"/>
           <w:szCs w:val="32"/>
-          <w:highlight w:val="red"/>
           <w:u w:val="single"/>
         </w:rPr>
-        <w:t>????</w:t>
+        <w:t>June 30, 2026</w:t>
       </w:r>
     </w:p>
     <w:p>
@@ -1413,53 +1412,6 @@
               </w:rPr>
               <w:t xml:space="preserve">| </w:t>
             </w:r>
-          </w:p>
-        </w:tc>
-      </w:tr>
-      <w:tr>
-        <w:trPr>
-          <w:trHeight w:val="1197"/>
-        </w:trPr>
-        <w:tc>
-          <w:tcPr>
-            <w:tcW w:w="7308" w:type="dxa"/>
-          </w:tcPr>
-          <w:p>
-            <w:pPr>
-              <w:autoSpaceDE w:val="0"/>
-              <w:autoSpaceDN w:val="0"/>
-              <w:adjustRightInd w:val="0"/>
-              <w:spacing w:before="0" w:line="240" w:lineRule="auto"/>
-              <w:rPr>
-                <w:rFonts w:ascii="Latha" w:hAnsi="Latha" w:cs="Latha"/>
-                <w:b/>
-                <w:bCs/>
-                <w:szCs w:val="28"/>
-                <w:cs/>
-                <w:lang w:bidi="ta-IN"/>
-              </w:rPr>
-            </w:pPr>
-          </w:p>
-        </w:tc>
-        <w:tc>
-          <w:tcPr>
-            <w:tcW w:w="7371" w:type="dxa"/>
-          </w:tcPr>
-          <w:p>
-            <w:pPr>
-              <w:autoSpaceDE w:val="0"/>
-              <w:autoSpaceDN w:val="0"/>
-              <w:adjustRightInd w:val="0"/>
-              <w:spacing w:before="0" w:line="240" w:lineRule="auto"/>
-              <w:rPr>
-                <w:rFonts w:ascii="Latha" w:hAnsi="Latha" w:cs="Latha"/>
-                <w:b/>
-                <w:bCs/>
-                <w:szCs w:val="28"/>
-                <w:cs/>
-                <w:lang w:bidi="ta-IN"/>
-              </w:rPr>
-            </w:pPr>
           </w:p>
         </w:tc>
       </w:tr>
@@ -2681,7 +2633,6 @@
                 <w:cs/>
                 <w:lang w:bidi="ta-IN"/>
               </w:rPr>
-              <w:lastRenderedPageBreak/>
               <w:t>38</w:t>
             </w:r>
             <w:r>
@@ -2931,6 +2882,7 @@
                 <w:cs/>
                 <w:lang w:bidi="ta-IN"/>
               </w:rPr>
+              <w:lastRenderedPageBreak/>
               <w:t>த்வா</w:t>
             </w:r>
             <w:r>
@@ -4334,6 +4286,7 @@
                 <w:cs/>
                 <w:lang w:bidi="ta-IN"/>
               </w:rPr>
+              <w:lastRenderedPageBreak/>
               <w:t>38</w:t>
             </w:r>
             <w:r>
@@ -4750,6 +4703,7 @@
                 <w:cs/>
                 <w:lang w:bidi="ta-IN"/>
               </w:rPr>
+              <w:lastRenderedPageBreak/>
               <w:t>த்வா</w:t>
             </w:r>
             <w:r>
@@ -5959,6 +5913,7 @@
                 <w:cs/>
                 <w:lang w:bidi="ta-IN"/>
               </w:rPr>
+              <w:lastRenderedPageBreak/>
               <w:t>43</w:t>
             </w:r>
             <w:r>
@@ -26606,6 +26561,7 @@
                 <w:cs/>
                 <w:lang w:bidi="ta-IN"/>
               </w:rPr>
+              <w:lastRenderedPageBreak/>
               <w:t>ஸாஶீ</w:t>
             </w:r>
             <w:r>
@@ -32946,7 +32902,17 @@
                 <w:cs/>
                 <w:lang w:bidi="ta-IN"/>
               </w:rPr>
-              <w:t>ம் ப்ராய</w:t>
+              <w:t xml:space="preserve">ம் </w:t>
+            </w:r>
+            <w:r>
+              <w:rPr>
+                <w:rFonts w:ascii="Latha" w:hAnsi="Latha" w:cs="Latha"/>
+                <w:szCs w:val="28"/>
+                <w:cs/>
+                <w:lang w:bidi="ta-IN"/>
+              </w:rPr>
+              <w:lastRenderedPageBreak/>
+              <w:t>ப்ராய</w:t>
             </w:r>
             <w:r>
               <w:rPr>
@@ -33107,7 +33073,6 @@
                 <w:cs/>
                 <w:lang w:bidi="ta-IN"/>
               </w:rPr>
-              <w:lastRenderedPageBreak/>
               <w:t>62)</w:t>
             </w:r>
             <w:r>
@@ -33455,6 +33420,7 @@
                 <w:cs/>
                 <w:lang w:bidi="ta-IN"/>
               </w:rPr>
+              <w:lastRenderedPageBreak/>
               <w:t>51</w:t>
             </w:r>
             <w:r>
@@ -35284,241 +35250,6 @@
                 <w:lang w:bidi="ta-IN"/>
               </w:rPr>
             </w:pPr>
-            <w:r>
-              <w:rPr>
-                <w:rFonts w:ascii="Latha" w:hAnsi="Latha" w:cs="Latha"/>
-                <w:b/>
-                <w:bCs/>
-                <w:szCs w:val="28"/>
-                <w:cs/>
-                <w:lang w:bidi="ta-IN"/>
-              </w:rPr>
-              <w:t>1</w:t>
-            </w:r>
-            <w:r>
-              <w:rPr>
-                <w:rFonts w:ascii="Latha" w:hAnsi="Latha" w:cs="Latha"/>
-                <w:b/>
-                <w:bCs/>
-                <w:szCs w:val="28"/>
-                <w:lang w:bidi="ta-IN"/>
-              </w:rPr>
-              <w:t>)</w:t>
-            </w:r>
-            <w:r>
-              <w:rPr>
-                <w:rFonts w:ascii="Latha" w:hAnsi="Latha" w:cs="Latha"/>
-                <w:szCs w:val="28"/>
-                <w:lang w:bidi="ta-IN"/>
-              </w:rPr>
-              <w:tab/>
-            </w:r>
-            <w:r>
-              <w:rPr>
-                <w:rFonts w:ascii="Latha" w:hAnsi="Latha" w:cs="Latha"/>
-                <w:b/>
-                <w:bCs/>
-                <w:szCs w:val="28"/>
-                <w:cs/>
-                <w:lang w:bidi="ta-IN"/>
-              </w:rPr>
-              <w:t>1</w:t>
-            </w:r>
-            <w:r>
-              <w:rPr>
-                <w:rFonts w:ascii="Latha" w:hAnsi="Latha" w:cs="Latha"/>
-                <w:b/>
-                <w:bCs/>
-                <w:szCs w:val="28"/>
-                <w:lang w:bidi="ta-IN"/>
-              </w:rPr>
-              <w:t>.</w:t>
-            </w:r>
-            <w:r>
-              <w:rPr>
-                <w:rFonts w:ascii="Latha" w:hAnsi="Latha" w:cs="Latha"/>
-                <w:b/>
-                <w:bCs/>
-                <w:szCs w:val="28"/>
-                <w:cs/>
-                <w:lang w:bidi="ta-IN"/>
-              </w:rPr>
-              <w:t>6</w:t>
-            </w:r>
-            <w:r>
-              <w:rPr>
-                <w:rFonts w:ascii="Latha" w:hAnsi="Latha" w:cs="Latha"/>
-                <w:b/>
-                <w:bCs/>
-                <w:szCs w:val="28"/>
-                <w:lang w:bidi="ta-IN"/>
-              </w:rPr>
-              <w:t>.</w:t>
-            </w:r>
-            <w:r>
-              <w:rPr>
-                <w:rFonts w:ascii="Latha" w:hAnsi="Latha" w:cs="Latha"/>
-                <w:b/>
-                <w:bCs/>
-                <w:szCs w:val="28"/>
-                <w:cs/>
-                <w:lang w:bidi="ta-IN"/>
-              </w:rPr>
-              <w:t>11</w:t>
-            </w:r>
-            <w:r>
-              <w:rPr>
-                <w:rFonts w:ascii="Latha" w:hAnsi="Latha" w:cs="Latha"/>
-                <w:b/>
-                <w:bCs/>
-                <w:szCs w:val="28"/>
-                <w:lang w:bidi="ta-IN"/>
-              </w:rPr>
-              <w:t>.4</w:t>
-            </w:r>
-            <w:r>
-              <w:rPr>
-                <w:rFonts w:ascii="Latha" w:hAnsi="Latha" w:cs="Latha"/>
-                <w:b/>
-                <w:bCs/>
-                <w:szCs w:val="28"/>
-                <w:lang w:bidi="ta-IN"/>
-              </w:rPr>
-              <w:t>(</w:t>
-            </w:r>
-            <w:r>
-              <w:rPr>
-                <w:rFonts w:ascii="Latha" w:hAnsi="Latha" w:cs="Latha"/>
-                <w:b/>
-                <w:bCs/>
-                <w:szCs w:val="28"/>
-                <w:cs/>
-                <w:lang w:bidi="ta-IN"/>
-              </w:rPr>
-              <w:t>1</w:t>
-            </w:r>
-            <w:r>
-              <w:rPr>
-                <w:rFonts w:ascii="Latha" w:hAnsi="Latha" w:cs="Latha"/>
-                <w:b/>
-                <w:bCs/>
-                <w:szCs w:val="28"/>
-                <w:lang w:bidi="ta-IN"/>
-              </w:rPr>
-              <w:t>)</w:t>
-            </w:r>
-            <w:r>
-              <w:rPr>
-                <w:rFonts w:ascii="Latha" w:hAnsi="Latha" w:cs="Latha"/>
-                <w:szCs w:val="28"/>
-                <w:lang w:bidi="ta-IN"/>
-              </w:rPr>
-              <w:t xml:space="preserve">-  </w:t>
-            </w:r>
-            <w:r>
-              <w:rPr>
-                <w:rFonts w:ascii="Latha" w:hAnsi="Latha" w:cs="Latha"/>
-                <w:szCs w:val="28"/>
-                <w:cs/>
-                <w:lang w:bidi="ta-IN"/>
-              </w:rPr>
-              <w:t>அ</w:t>
-            </w:r>
-            <w:r>
-              <w:rPr>
-                <w:rFonts w:ascii="BRH Tamil Tab Extra" w:hAnsi="BRH Tamil Tab Extra" w:cs="Latha"/>
-                <w:b/>
-                <w:bCs/>
-                <w:sz w:val="32"/>
-                <w:szCs w:val="32"/>
-                <w:lang w:bidi="ta-IN"/>
-              </w:rPr>
-              <w:t>…</w:t>
-            </w:r>
-            <w:r>
-              <w:rPr>
-                <w:rFonts w:ascii="Latha" w:hAnsi="Latha" w:cs="Latha"/>
-                <w:szCs w:val="28"/>
-                <w:cs/>
-                <w:lang w:bidi="ta-IN"/>
-              </w:rPr>
-              <w:t>ஜ</w:t>
-            </w:r>
-            <w:r>
-              <w:rPr>
-                <w:rFonts w:ascii="BRH Tamil Tab Extra" w:hAnsi="BRH Tamil Tab Extra" w:cs="Latha"/>
-                <w:b/>
-                <w:bCs/>
-                <w:sz w:val="32"/>
-                <w:szCs w:val="32"/>
-                <w:lang w:bidi="ta-IN"/>
-              </w:rPr>
-              <w:t>…</w:t>
-            </w:r>
-            <w:r>
-              <w:rPr>
-                <w:rFonts w:ascii="Latha" w:hAnsi="Latha" w:cs="Latha"/>
-                <w:szCs w:val="28"/>
-                <w:highlight w:val="yellow"/>
-                <w:cs/>
-                <w:lang w:bidi="ta-IN"/>
-              </w:rPr>
-              <w:t>ன</w:t>
-            </w:r>
-            <w:r>
-              <w:rPr>
-                <w:rFonts w:ascii="Latha" w:hAnsi="Latha" w:cs="Latha"/>
-                <w:szCs w:val="28"/>
-                <w:cs/>
-                <w:lang w:bidi="ta-IN"/>
-              </w:rPr>
-              <w:t>ய</w:t>
-            </w:r>
-            <w:r>
-              <w:rPr>
-                <w:rFonts w:ascii="BRH Tamil Tab Extra" w:hAnsi="BRH Tamil Tab Extra" w:cs="Latha"/>
-                <w:b/>
-                <w:bCs/>
-                <w:sz w:val="32"/>
-                <w:szCs w:val="32"/>
-                <w:lang w:bidi="ta-IN"/>
-              </w:rPr>
-              <w:t>…</w:t>
-            </w:r>
-            <w:r>
-              <w:rPr>
-                <w:rFonts w:ascii="Latha" w:hAnsi="Latha" w:cs="Latha"/>
-                <w:szCs w:val="28"/>
-                <w:cs/>
-                <w:lang w:bidi="ta-IN"/>
-              </w:rPr>
-              <w:t xml:space="preserve">ன்ன் </w:t>
-            </w:r>
-            <w:r>
-              <w:rPr>
-                <w:rFonts w:ascii="Latha" w:hAnsi="Latha" w:cs="Latha"/>
-                <w:szCs w:val="28"/>
-                <w:lang w:bidi="ta-IN"/>
-              </w:rPr>
-              <w:t xml:space="preserve">| </w:t>
-            </w:r>
-            <w:r>
-              <w:rPr>
-                <w:rFonts w:ascii="Latha" w:hAnsi="Latha" w:cs="Latha"/>
-                <w:szCs w:val="28"/>
-                <w:cs/>
-                <w:lang w:bidi="ta-IN"/>
-              </w:rPr>
-              <w:t xml:space="preserve">யே </w:t>
-            </w:r>
-            <w:r>
-              <w:rPr>
-                <w:rFonts w:ascii="Latha" w:hAnsi="Latha" w:cs="Latha"/>
-                <w:szCs w:val="28"/>
-                <w:lang w:bidi="ta-IN"/>
-              </w:rPr>
-              <w:t>|</w:t>
-            </w:r>
           </w:p>
           <w:p>
             <w:pPr>
@@ -35526,6 +35257,266 @@
               <w:autoSpaceDN w:val="0"/>
               <w:adjustRightInd w:val="0"/>
               <w:rPr>
+                <w:rFonts w:ascii="Latha" w:hAnsi="Latha" w:cs="Latha"/>
+                <w:szCs w:val="28"/>
+                <w:lang w:bidi="ta-IN"/>
+              </w:rPr>
+            </w:pPr>
+          </w:p>
+          <w:p>
+            <w:pPr>
+              <w:autoSpaceDE w:val="0"/>
+              <w:autoSpaceDN w:val="0"/>
+              <w:adjustRightInd w:val="0"/>
+              <w:rPr>
+                <w:rFonts w:ascii="Latha" w:hAnsi="Latha" w:cs="Latha"/>
+                <w:szCs w:val="28"/>
+                <w:lang w:bidi="ta-IN"/>
+              </w:rPr>
+            </w:pPr>
+            <w:r>
+              <w:rPr>
+                <w:rFonts w:ascii="Latha" w:hAnsi="Latha" w:cs="Latha"/>
+                <w:b/>
+                <w:bCs/>
+                <w:szCs w:val="28"/>
+                <w:cs/>
+                <w:lang w:bidi="ta-IN"/>
+              </w:rPr>
+              <w:lastRenderedPageBreak/>
+              <w:t>1</w:t>
+            </w:r>
+            <w:r>
+              <w:rPr>
+                <w:rFonts w:ascii="Latha" w:hAnsi="Latha" w:cs="Latha"/>
+                <w:b/>
+                <w:bCs/>
+                <w:szCs w:val="28"/>
+                <w:lang w:bidi="ta-IN"/>
+              </w:rPr>
+              <w:t>)</w:t>
+            </w:r>
+            <w:r>
+              <w:rPr>
+                <w:rFonts w:ascii="Latha" w:hAnsi="Latha" w:cs="Latha"/>
+                <w:szCs w:val="28"/>
+                <w:lang w:bidi="ta-IN"/>
+              </w:rPr>
+              <w:tab/>
+            </w:r>
+            <w:r>
+              <w:rPr>
+                <w:rFonts w:ascii="Latha" w:hAnsi="Latha" w:cs="Latha"/>
+                <w:b/>
+                <w:bCs/>
+                <w:szCs w:val="28"/>
+                <w:cs/>
+                <w:lang w:bidi="ta-IN"/>
+              </w:rPr>
+              <w:t>1</w:t>
+            </w:r>
+            <w:r>
+              <w:rPr>
+                <w:rFonts w:ascii="Latha" w:hAnsi="Latha" w:cs="Latha"/>
+                <w:b/>
+                <w:bCs/>
+                <w:szCs w:val="28"/>
+                <w:lang w:bidi="ta-IN"/>
+              </w:rPr>
+              <w:t>.</w:t>
+            </w:r>
+            <w:r>
+              <w:rPr>
+                <w:rFonts w:ascii="Latha" w:hAnsi="Latha" w:cs="Latha"/>
+                <w:b/>
+                <w:bCs/>
+                <w:szCs w:val="28"/>
+                <w:cs/>
+                <w:lang w:bidi="ta-IN"/>
+              </w:rPr>
+              <w:t>6</w:t>
+            </w:r>
+            <w:r>
+              <w:rPr>
+                <w:rFonts w:ascii="Latha" w:hAnsi="Latha" w:cs="Latha"/>
+                <w:b/>
+                <w:bCs/>
+                <w:szCs w:val="28"/>
+                <w:lang w:bidi="ta-IN"/>
+              </w:rPr>
+              <w:t>.</w:t>
+            </w:r>
+            <w:r>
+              <w:rPr>
+                <w:rFonts w:ascii="Latha" w:hAnsi="Latha" w:cs="Latha"/>
+                <w:b/>
+                <w:bCs/>
+                <w:szCs w:val="28"/>
+                <w:cs/>
+                <w:lang w:bidi="ta-IN"/>
+              </w:rPr>
+              <w:t>11</w:t>
+            </w:r>
+            <w:r>
+              <w:rPr>
+                <w:rFonts w:ascii="Latha" w:hAnsi="Latha" w:cs="Latha"/>
+                <w:b/>
+                <w:bCs/>
+                <w:szCs w:val="28"/>
+                <w:lang w:bidi="ta-IN"/>
+              </w:rPr>
+              <w:t>.4</w:t>
+            </w:r>
+            <w:r>
+              <w:rPr>
+                <w:rFonts w:ascii="Latha" w:hAnsi="Latha" w:cs="Latha"/>
+                <w:b/>
+                <w:bCs/>
+                <w:szCs w:val="28"/>
+                <w:lang w:bidi="ta-IN"/>
+              </w:rPr>
+              <w:t>(</w:t>
+            </w:r>
+            <w:r>
+              <w:rPr>
+                <w:rFonts w:ascii="Latha" w:hAnsi="Latha" w:cs="Latha"/>
+                <w:b/>
+                <w:bCs/>
+                <w:szCs w:val="28"/>
+                <w:cs/>
+                <w:lang w:bidi="ta-IN"/>
+              </w:rPr>
+              <w:t>1</w:t>
+            </w:r>
+            <w:r>
+              <w:rPr>
+                <w:rFonts w:ascii="Latha" w:hAnsi="Latha" w:cs="Latha"/>
+                <w:b/>
+                <w:bCs/>
+                <w:szCs w:val="28"/>
+                <w:lang w:bidi="ta-IN"/>
+              </w:rPr>
+              <w:t>)</w:t>
+            </w:r>
+            <w:r>
+              <w:rPr>
+                <w:rFonts w:ascii="Latha" w:hAnsi="Latha" w:cs="Latha"/>
+                <w:szCs w:val="28"/>
+                <w:lang w:bidi="ta-IN"/>
+              </w:rPr>
+              <w:t xml:space="preserve">-  </w:t>
+            </w:r>
+            <w:r>
+              <w:rPr>
+                <w:rFonts w:ascii="Latha" w:hAnsi="Latha" w:cs="Latha"/>
+                <w:szCs w:val="28"/>
+                <w:cs/>
+                <w:lang w:bidi="ta-IN"/>
+              </w:rPr>
+              <w:t>அ</w:t>
+            </w:r>
+            <w:r>
+              <w:rPr>
+                <w:rFonts w:ascii="BRH Tamil Tab Extra" w:hAnsi="BRH Tamil Tab Extra" w:cs="Latha"/>
+                <w:b/>
+                <w:bCs/>
+                <w:sz w:val="32"/>
+                <w:szCs w:val="32"/>
+                <w:lang w:bidi="ta-IN"/>
+              </w:rPr>
+              <w:t>…</w:t>
+            </w:r>
+            <w:r>
+              <w:rPr>
+                <w:rFonts w:ascii="Latha" w:hAnsi="Latha" w:cs="Latha"/>
+                <w:szCs w:val="28"/>
+                <w:cs/>
+                <w:lang w:bidi="ta-IN"/>
+              </w:rPr>
+              <w:t>ஜ</w:t>
+            </w:r>
+            <w:r>
+              <w:rPr>
+                <w:rFonts w:ascii="BRH Tamil Tab Extra" w:hAnsi="BRH Tamil Tab Extra" w:cs="Latha"/>
+                <w:b/>
+                <w:bCs/>
+                <w:sz w:val="32"/>
+                <w:szCs w:val="32"/>
+                <w:lang w:bidi="ta-IN"/>
+              </w:rPr>
+              <w:t>…</w:t>
+            </w:r>
+            <w:r>
+              <w:rPr>
+                <w:rFonts w:ascii="Latha" w:hAnsi="Latha" w:cs="Latha"/>
+                <w:szCs w:val="28"/>
+                <w:highlight w:val="yellow"/>
+                <w:cs/>
+                <w:lang w:bidi="ta-IN"/>
+              </w:rPr>
+              <w:t>ன</w:t>
+            </w:r>
+            <w:r>
+              <w:rPr>
+                <w:rFonts w:ascii="Latha" w:hAnsi="Latha" w:cs="Latha"/>
+                <w:szCs w:val="28"/>
+                <w:cs/>
+                <w:lang w:bidi="ta-IN"/>
+              </w:rPr>
+              <w:t>ய</w:t>
+            </w:r>
+            <w:r>
+              <w:rPr>
+                <w:rFonts w:ascii="BRH Tamil Tab Extra" w:hAnsi="BRH Tamil Tab Extra" w:cs="Latha"/>
+                <w:b/>
+                <w:bCs/>
+                <w:sz w:val="32"/>
+                <w:szCs w:val="32"/>
+                <w:lang w:bidi="ta-IN"/>
+              </w:rPr>
+              <w:t>…</w:t>
+            </w:r>
+            <w:r>
+              <w:rPr>
+                <w:rFonts w:ascii="Latha" w:hAnsi="Latha" w:cs="Latha"/>
+                <w:szCs w:val="28"/>
+                <w:cs/>
+                <w:lang w:bidi="ta-IN"/>
+              </w:rPr>
+              <w:t xml:space="preserve">ன்ன் </w:t>
+            </w:r>
+            <w:r>
+              <w:rPr>
+                <w:rFonts w:ascii="Latha" w:hAnsi="Latha" w:cs="Latha"/>
+                <w:szCs w:val="28"/>
+                <w:lang w:bidi="ta-IN"/>
+              </w:rPr>
+              <w:t xml:space="preserve">| </w:t>
+            </w:r>
+            <w:r>
+              <w:rPr>
+                <w:rFonts w:ascii="Latha" w:hAnsi="Latha" w:cs="Latha"/>
+                <w:szCs w:val="28"/>
+                <w:cs/>
+                <w:lang w:bidi="ta-IN"/>
+              </w:rPr>
+              <w:t xml:space="preserve">யே </w:t>
+            </w:r>
+            <w:r>
+              <w:rPr>
+                <w:rFonts w:ascii="Latha" w:hAnsi="Latha" w:cs="Latha"/>
+                <w:szCs w:val="28"/>
+                <w:lang w:bidi="ta-IN"/>
+              </w:rPr>
+              <w:t>|</w:t>
+            </w:r>
+          </w:p>
+          <w:p>
+            <w:pPr>
+              <w:autoSpaceDE w:val="0"/>
+              <w:autoSpaceDN w:val="0"/>
+              <w:adjustRightInd w:val="0"/>
+              <w:rPr>
                 <w:rFonts w:cs="BRH Malayalam Extra"/>
                 <w:color w:val="FF0000"/>
                 <w:szCs w:val="40"/>
@@ -35539,7 +35530,6 @@
                 <w:cs/>
                 <w:lang w:bidi="ta-IN"/>
               </w:rPr>
-              <w:lastRenderedPageBreak/>
               <w:t>ஆ</w:t>
             </w:r>
             <w:r>
@@ -36584,253 +36574,6 @@
                 <w:lang w:bidi="ta-IN"/>
               </w:rPr>
             </w:pPr>
-            <w:r>
-              <w:rPr>
-                <w:rFonts w:ascii="Latha" w:hAnsi="Latha" w:cs="Latha"/>
-                <w:b/>
-                <w:bCs/>
-                <w:szCs w:val="28"/>
-                <w:cs/>
-                <w:lang w:bidi="ta-IN"/>
-              </w:rPr>
-              <w:t>1</w:t>
-            </w:r>
-            <w:r>
-              <w:rPr>
-                <w:rFonts w:ascii="Latha" w:hAnsi="Latha" w:cs="Latha"/>
-                <w:b/>
-                <w:bCs/>
-                <w:szCs w:val="28"/>
-                <w:lang w:bidi="ta-IN"/>
-              </w:rPr>
-              <w:t>)</w:t>
-            </w:r>
-            <w:r>
-              <w:rPr>
-                <w:rFonts w:ascii="Latha" w:hAnsi="Latha" w:cs="Latha"/>
-                <w:szCs w:val="28"/>
-                <w:lang w:bidi="ta-IN"/>
-              </w:rPr>
-              <w:tab/>
-            </w:r>
-            <w:r>
-              <w:rPr>
-                <w:rFonts w:ascii="Latha" w:hAnsi="Latha" w:cs="Latha"/>
-                <w:b/>
-                <w:bCs/>
-                <w:szCs w:val="28"/>
-                <w:cs/>
-                <w:lang w:bidi="ta-IN"/>
-              </w:rPr>
-              <w:t>1</w:t>
-            </w:r>
-            <w:r>
-              <w:rPr>
-                <w:rFonts w:ascii="Latha" w:hAnsi="Latha" w:cs="Latha"/>
-                <w:b/>
-                <w:bCs/>
-                <w:szCs w:val="28"/>
-                <w:lang w:bidi="ta-IN"/>
-              </w:rPr>
-              <w:t>.</w:t>
-            </w:r>
-            <w:r>
-              <w:rPr>
-                <w:rFonts w:ascii="Latha" w:hAnsi="Latha" w:cs="Latha"/>
-                <w:b/>
-                <w:bCs/>
-                <w:szCs w:val="28"/>
-                <w:cs/>
-                <w:lang w:bidi="ta-IN"/>
-              </w:rPr>
-              <w:t>6</w:t>
-            </w:r>
-            <w:r>
-              <w:rPr>
-                <w:rFonts w:ascii="Latha" w:hAnsi="Latha" w:cs="Latha"/>
-                <w:b/>
-                <w:bCs/>
-                <w:szCs w:val="28"/>
-                <w:lang w:bidi="ta-IN"/>
-              </w:rPr>
-              <w:t>.</w:t>
-            </w:r>
-            <w:r>
-              <w:rPr>
-                <w:rFonts w:ascii="Latha" w:hAnsi="Latha" w:cs="Latha"/>
-                <w:b/>
-                <w:bCs/>
-                <w:szCs w:val="28"/>
-                <w:cs/>
-                <w:lang w:bidi="ta-IN"/>
-              </w:rPr>
-              <w:t>11</w:t>
-            </w:r>
-            <w:r>
-              <w:rPr>
-                <w:rFonts w:ascii="Latha" w:hAnsi="Latha" w:cs="Latha"/>
-                <w:b/>
-                <w:bCs/>
-                <w:szCs w:val="28"/>
-                <w:lang w:bidi="ta-IN"/>
-              </w:rPr>
-              <w:t>.4</w:t>
-            </w:r>
-            <w:r>
-              <w:rPr>
-                <w:rFonts w:ascii="Latha" w:hAnsi="Latha" w:cs="Latha"/>
-                <w:b/>
-                <w:bCs/>
-                <w:szCs w:val="28"/>
-                <w:lang w:bidi="ta-IN"/>
-              </w:rPr>
-              <w:t>(</w:t>
-            </w:r>
-            <w:r>
-              <w:rPr>
-                <w:rFonts w:ascii="Latha" w:hAnsi="Latha" w:cs="Latha"/>
-                <w:b/>
-                <w:bCs/>
-                <w:szCs w:val="28"/>
-                <w:cs/>
-                <w:lang w:bidi="ta-IN"/>
-              </w:rPr>
-              <w:t>1</w:t>
-            </w:r>
-            <w:r>
-              <w:rPr>
-                <w:rFonts w:ascii="Latha" w:hAnsi="Latha" w:cs="Latha"/>
-                <w:b/>
-                <w:bCs/>
-                <w:szCs w:val="28"/>
-                <w:lang w:bidi="ta-IN"/>
-              </w:rPr>
-              <w:t>)</w:t>
-            </w:r>
-            <w:r>
-              <w:rPr>
-                <w:rFonts w:ascii="Latha" w:hAnsi="Latha" w:cs="Latha"/>
-                <w:szCs w:val="28"/>
-                <w:lang w:bidi="ta-IN"/>
-              </w:rPr>
-              <w:t xml:space="preserve">-  </w:t>
-            </w:r>
-            <w:r>
-              <w:rPr>
-                <w:rFonts w:ascii="Latha" w:hAnsi="Latha" w:cs="Latha"/>
-                <w:szCs w:val="28"/>
-                <w:cs/>
-                <w:lang w:bidi="ta-IN"/>
-              </w:rPr>
-              <w:t>அ</w:t>
-            </w:r>
-            <w:r>
-              <w:rPr>
-                <w:rFonts w:ascii="BRH Tamil Tab Extra" w:hAnsi="BRH Tamil Tab Extra" w:cs="Latha"/>
-                <w:b/>
-                <w:bCs/>
-                <w:sz w:val="32"/>
-                <w:szCs w:val="32"/>
-                <w:lang w:bidi="ta-IN"/>
-              </w:rPr>
-              <w:t>…</w:t>
-            </w:r>
-            <w:r>
-              <w:rPr>
-                <w:rFonts w:ascii="Latha" w:hAnsi="Latha" w:cs="Latha"/>
-                <w:szCs w:val="28"/>
-                <w:cs/>
-                <w:lang w:bidi="ta-IN"/>
-              </w:rPr>
-              <w:t>ஜ</w:t>
-            </w:r>
-            <w:r>
-              <w:rPr>
-                <w:rFonts w:ascii="BRH Tamil Tab Extra" w:hAnsi="BRH Tamil Tab Extra" w:cs="Latha"/>
-                <w:b/>
-                <w:bCs/>
-                <w:sz w:val="32"/>
-                <w:szCs w:val="32"/>
-                <w:highlight w:val="green"/>
-                <w:lang w:bidi="ta-IN"/>
-              </w:rPr>
-              <w:t>…</w:t>
-            </w:r>
-            <w:r>
-              <w:rPr>
-                <w:rFonts w:ascii="Latha" w:hAnsi="Latha" w:cs="Latha"/>
-                <w:szCs w:val="28"/>
-                <w:highlight w:val="green"/>
-                <w:cs/>
-                <w:lang w:bidi="ta-IN"/>
-              </w:rPr>
-              <w:t>ன</w:t>
-            </w:r>
-            <w:r>
-              <w:rPr>
-                <w:rFonts w:ascii="BRH Tamil Tab Extra" w:hAnsi="BRH Tamil Tab Extra" w:cs="Latha"/>
-                <w:b/>
-                <w:bCs/>
-                <w:sz w:val="32"/>
-                <w:szCs w:val="32"/>
-                <w:lang w:bidi="ta-IN"/>
-              </w:rPr>
-              <w:t>…</w:t>
-            </w:r>
-            <w:r>
-              <w:rPr>
-                <w:rFonts w:ascii="Latha" w:hAnsi="Latha" w:cs="Latha"/>
-                <w:szCs w:val="28"/>
-                <w:cs/>
-                <w:lang w:bidi="ta-IN"/>
-              </w:rPr>
-              <w:t>ய</w:t>
-            </w:r>
-            <w:r>
-              <w:rPr>
-                <w:rFonts w:ascii="BRH Tamil Tab Extra" w:hAnsi="BRH Tamil Tab Extra" w:cs="Latha"/>
-                <w:b/>
-                <w:bCs/>
-                <w:sz w:val="32"/>
-                <w:szCs w:val="32"/>
-                <w:lang w:bidi="ta-IN"/>
-              </w:rPr>
-              <w:t>…</w:t>
-            </w:r>
-            <w:r>
-              <w:rPr>
-                <w:rFonts w:ascii="Latha" w:hAnsi="Latha" w:cs="Latha"/>
-                <w:szCs w:val="28"/>
-                <w:cs/>
-                <w:lang w:bidi="ta-IN"/>
-              </w:rPr>
-              <w:t xml:space="preserve">ன்ன் </w:t>
-            </w:r>
-            <w:r>
-              <w:rPr>
-                <w:rFonts w:ascii="Latha" w:hAnsi="Latha" w:cs="Latha"/>
-                <w:szCs w:val="28"/>
-                <w:lang w:bidi="ta-IN"/>
-              </w:rPr>
-              <w:t xml:space="preserve">| </w:t>
-            </w:r>
-            <w:r>
-              <w:rPr>
-                <w:rFonts w:ascii="Latha" w:hAnsi="Latha" w:cs="Latha"/>
-                <w:szCs w:val="28"/>
-                <w:cs/>
-                <w:lang w:bidi="ta-IN"/>
-              </w:rPr>
-              <w:t xml:space="preserve">யே </w:t>
-            </w:r>
-            <w:r>
-              <w:rPr>
-                <w:rFonts w:ascii="Latha" w:hAnsi="Latha" w:cs="Latha"/>
-                <w:szCs w:val="28"/>
-                <w:lang w:bidi="ta-IN"/>
-              </w:rPr>
-              <w:t>|</w:t>
-            </w:r>
           </w:p>
           <w:p>
             <w:pPr>
@@ -36838,6 +36581,278 @@
               <w:autoSpaceDN w:val="0"/>
               <w:adjustRightInd w:val="0"/>
               <w:rPr>
+                <w:rFonts w:ascii="Latha" w:hAnsi="Latha" w:cs="Latha"/>
+                <w:szCs w:val="28"/>
+                <w:lang w:bidi="ta-IN"/>
+              </w:rPr>
+            </w:pPr>
+          </w:p>
+          <w:p>
+            <w:pPr>
+              <w:autoSpaceDE w:val="0"/>
+              <w:autoSpaceDN w:val="0"/>
+              <w:adjustRightInd w:val="0"/>
+              <w:rPr>
+                <w:rFonts w:ascii="Latha" w:hAnsi="Latha" w:cs="Latha"/>
+                <w:szCs w:val="28"/>
+                <w:lang w:bidi="ta-IN"/>
+              </w:rPr>
+            </w:pPr>
+            <w:r>
+              <w:rPr>
+                <w:rFonts w:ascii="Latha" w:hAnsi="Latha" w:cs="Latha"/>
+                <w:b/>
+                <w:bCs/>
+                <w:szCs w:val="28"/>
+                <w:cs/>
+                <w:lang w:bidi="ta-IN"/>
+              </w:rPr>
+              <w:lastRenderedPageBreak/>
+              <w:t>1</w:t>
+            </w:r>
+            <w:r>
+              <w:rPr>
+                <w:rFonts w:ascii="Latha" w:hAnsi="Latha" w:cs="Latha"/>
+                <w:b/>
+                <w:bCs/>
+                <w:szCs w:val="28"/>
+                <w:lang w:bidi="ta-IN"/>
+              </w:rPr>
+              <w:t>)</w:t>
+            </w:r>
+            <w:r>
+              <w:rPr>
+                <w:rFonts w:ascii="Latha" w:hAnsi="Latha" w:cs="Latha"/>
+                <w:szCs w:val="28"/>
+                <w:lang w:bidi="ta-IN"/>
+              </w:rPr>
+              <w:tab/>
+            </w:r>
+            <w:r>
+              <w:rPr>
+                <w:rFonts w:ascii="Latha" w:hAnsi="Latha" w:cs="Latha"/>
+                <w:b/>
+                <w:bCs/>
+                <w:szCs w:val="28"/>
+                <w:cs/>
+                <w:lang w:bidi="ta-IN"/>
+              </w:rPr>
+              <w:t>1</w:t>
+            </w:r>
+            <w:r>
+              <w:rPr>
+                <w:rFonts w:ascii="Latha" w:hAnsi="Latha" w:cs="Latha"/>
+                <w:b/>
+                <w:bCs/>
+                <w:szCs w:val="28"/>
+                <w:lang w:bidi="ta-IN"/>
+              </w:rPr>
+              <w:t>.</w:t>
+            </w:r>
+            <w:r>
+              <w:rPr>
+                <w:rFonts w:ascii="Latha" w:hAnsi="Latha" w:cs="Latha"/>
+                <w:b/>
+                <w:bCs/>
+                <w:szCs w:val="28"/>
+                <w:cs/>
+                <w:lang w:bidi="ta-IN"/>
+              </w:rPr>
+              <w:t>6</w:t>
+            </w:r>
+            <w:r>
+              <w:rPr>
+                <w:rFonts w:ascii="Latha" w:hAnsi="Latha" w:cs="Latha"/>
+                <w:b/>
+                <w:bCs/>
+                <w:szCs w:val="28"/>
+                <w:lang w:bidi="ta-IN"/>
+              </w:rPr>
+              <w:t>.</w:t>
+            </w:r>
+            <w:r>
+              <w:rPr>
+                <w:rFonts w:ascii="Latha" w:hAnsi="Latha" w:cs="Latha"/>
+                <w:b/>
+                <w:bCs/>
+                <w:szCs w:val="28"/>
+                <w:cs/>
+                <w:lang w:bidi="ta-IN"/>
+              </w:rPr>
+              <w:t>11</w:t>
+            </w:r>
+            <w:r>
+              <w:rPr>
+                <w:rFonts w:ascii="Latha" w:hAnsi="Latha" w:cs="Latha"/>
+                <w:b/>
+                <w:bCs/>
+                <w:szCs w:val="28"/>
+                <w:lang w:bidi="ta-IN"/>
+              </w:rPr>
+              <w:t>.4</w:t>
+            </w:r>
+            <w:r>
+              <w:rPr>
+                <w:rFonts w:ascii="Latha" w:hAnsi="Latha" w:cs="Latha"/>
+                <w:b/>
+                <w:bCs/>
+                <w:szCs w:val="28"/>
+                <w:lang w:bidi="ta-IN"/>
+              </w:rPr>
+              <w:t>(</w:t>
+            </w:r>
+            <w:r>
+              <w:rPr>
+                <w:rFonts w:ascii="Latha" w:hAnsi="Latha" w:cs="Latha"/>
+                <w:b/>
+                <w:bCs/>
+                <w:szCs w:val="28"/>
+                <w:cs/>
+                <w:lang w:bidi="ta-IN"/>
+              </w:rPr>
+              <w:t>1</w:t>
+            </w:r>
+            <w:r>
+              <w:rPr>
+                <w:rFonts w:ascii="Latha" w:hAnsi="Latha" w:cs="Latha"/>
+                <w:b/>
+                <w:bCs/>
+                <w:szCs w:val="28"/>
+                <w:lang w:bidi="ta-IN"/>
+              </w:rPr>
+              <w:t>)</w:t>
+            </w:r>
+            <w:r>
+              <w:rPr>
+                <w:rFonts w:ascii="Latha" w:hAnsi="Latha" w:cs="Latha"/>
+                <w:szCs w:val="28"/>
+                <w:lang w:bidi="ta-IN"/>
+              </w:rPr>
+              <w:t xml:space="preserve">-  </w:t>
+            </w:r>
+            <w:r>
+              <w:rPr>
+                <w:rFonts w:ascii="Latha" w:hAnsi="Latha" w:cs="Latha"/>
+                <w:szCs w:val="28"/>
+                <w:cs/>
+                <w:lang w:bidi="ta-IN"/>
+              </w:rPr>
+              <w:t>அ</w:t>
+            </w:r>
+            <w:r>
+              <w:rPr>
+                <w:rFonts w:ascii="BRH Tamil Tab Extra" w:hAnsi="BRH Tamil Tab Extra" w:cs="Latha"/>
+                <w:b/>
+                <w:bCs/>
+                <w:sz w:val="32"/>
+                <w:szCs w:val="32"/>
+                <w:lang w:bidi="ta-IN"/>
+              </w:rPr>
+              <w:t>…</w:t>
+            </w:r>
+            <w:r>
+              <w:rPr>
+                <w:rFonts w:ascii="Latha" w:hAnsi="Latha" w:cs="Latha"/>
+                <w:szCs w:val="28"/>
+                <w:cs/>
+                <w:lang w:bidi="ta-IN"/>
+              </w:rPr>
+              <w:t>ஜ</w:t>
+            </w:r>
+            <w:r>
+              <w:rPr>
+                <w:rFonts w:ascii="BRH Tamil Tab Extra" w:hAnsi="BRH Tamil Tab Extra" w:cs="Latha"/>
+                <w:b/>
+                <w:bCs/>
+                <w:sz w:val="32"/>
+                <w:szCs w:val="32"/>
+                <w:highlight w:val="green"/>
+                <w:lang w:bidi="ta-IN"/>
+              </w:rPr>
+              <w:t>…</w:t>
+            </w:r>
+            <w:r>
+              <w:rPr>
+                <w:rFonts w:ascii="Latha" w:hAnsi="Latha" w:cs="Latha"/>
+                <w:szCs w:val="28"/>
+                <w:highlight w:val="green"/>
+                <w:cs/>
+                <w:lang w:bidi="ta-IN"/>
+              </w:rPr>
+              <w:t>ன</w:t>
+            </w:r>
+            <w:r>
+              <w:rPr>
+                <w:rFonts w:ascii="BRH Tamil Tab Extra" w:hAnsi="BRH Tamil Tab Extra" w:cs="Latha"/>
+                <w:b/>
+                <w:bCs/>
+                <w:sz w:val="32"/>
+                <w:szCs w:val="32"/>
+                <w:lang w:bidi="ta-IN"/>
+              </w:rPr>
+              <w:t>…</w:t>
+            </w:r>
+            <w:r>
+              <w:rPr>
+                <w:rFonts w:ascii="Latha" w:hAnsi="Latha" w:cs="Latha"/>
+                <w:szCs w:val="28"/>
+                <w:cs/>
+                <w:lang w:bidi="ta-IN"/>
+              </w:rPr>
+              <w:t>ய</w:t>
+            </w:r>
+            <w:r>
+              <w:rPr>
+                <w:rFonts w:ascii="BRH Tamil Tab Extra" w:hAnsi="BRH Tamil Tab Extra" w:cs="Latha"/>
+                <w:b/>
+                <w:bCs/>
+                <w:sz w:val="32"/>
+                <w:szCs w:val="32"/>
+                <w:lang w:bidi="ta-IN"/>
+              </w:rPr>
+              <w:t>…</w:t>
+            </w:r>
+            <w:r>
+              <w:rPr>
+                <w:rFonts w:ascii="Latha" w:hAnsi="Latha" w:cs="Latha"/>
+                <w:szCs w:val="28"/>
+                <w:cs/>
+                <w:lang w:bidi="ta-IN"/>
+              </w:rPr>
+              <w:t xml:space="preserve">ன்ன் </w:t>
+            </w:r>
+            <w:r>
+              <w:rPr>
+                <w:rFonts w:ascii="Latha" w:hAnsi="Latha" w:cs="Latha"/>
+                <w:szCs w:val="28"/>
+                <w:lang w:bidi="ta-IN"/>
+              </w:rPr>
+              <w:t xml:space="preserve">| </w:t>
+            </w:r>
+            <w:r>
+              <w:rPr>
+                <w:rFonts w:ascii="Latha" w:hAnsi="Latha" w:cs="Latha"/>
+                <w:szCs w:val="28"/>
+                <w:cs/>
+                <w:lang w:bidi="ta-IN"/>
+              </w:rPr>
+              <w:t xml:space="preserve">யே </w:t>
+            </w:r>
+            <w:r>
+              <w:rPr>
+                <w:rFonts w:ascii="Latha" w:hAnsi="Latha" w:cs="Latha"/>
+                <w:szCs w:val="28"/>
+                <w:lang w:bidi="ta-IN"/>
+              </w:rPr>
+              <w:t>|</w:t>
+            </w:r>
+          </w:p>
+          <w:p>
+            <w:pPr>
+              <w:autoSpaceDE w:val="0"/>
+              <w:autoSpaceDN w:val="0"/>
+              <w:adjustRightInd w:val="0"/>
+              <w:rPr>
                 <w:rFonts w:cs="BRH Malayalam Extra"/>
                 <w:color w:val="FF0000"/>
                 <w:szCs w:val="40"/>
@@ -36852,7 +36867,6 @@
                 <w:cs/>
                 <w:lang w:bidi="ta-IN"/>
               </w:rPr>
-              <w:lastRenderedPageBreak/>
               <w:t>அ</w:t>
             </w:r>
             <w:r>
@@ -39374,6 +39388,48 @@
     </w:tbl>
     <w:p>
       <w:pPr>
+        <w:pBdr>
+          <w:bottom w:val="double" w:sz="6" w:space="1" w:color="auto"/>
+        </w:pBdr>
+        <w:spacing w:before="0" w:line="240" w:lineRule="auto"/>
+        <w:jc w:val="center"/>
+        <w:rPr>
+          <w:b/>
+          <w:bCs/>
+          <w:sz w:val="32"/>
+          <w:szCs w:val="32"/>
+          <w:u w:val="single"/>
+        </w:rPr>
+      </w:pPr>
+    </w:p>
+    <w:p>
+      <w:pPr>
+        <w:spacing w:before="0" w:line="240" w:lineRule="auto"/>
+        <w:jc w:val="center"/>
+        <w:rPr>
+          <w:b/>
+          <w:bCs/>
+          <w:sz w:val="32"/>
+          <w:szCs w:val="32"/>
+          <w:u w:val="single"/>
+        </w:rPr>
+      </w:pPr>
+    </w:p>
+    <w:p>
+      <w:pPr>
+        <w:spacing w:before="0" w:line="240" w:lineRule="auto"/>
+        <w:jc w:val="center"/>
+        <w:rPr>
+          <w:b/>
+          <w:bCs/>
+          <w:sz w:val="32"/>
+          <w:szCs w:val="32"/>
+          <w:u w:val="single"/>
+        </w:rPr>
+      </w:pPr>
+    </w:p>
+    <w:p>
+      <w:pPr>
         <w:spacing w:before="0" w:line="240" w:lineRule="auto"/>
         <w:jc w:val="center"/>
         <w:rPr>
@@ -39392,26 +39448,7 @@
           <w:szCs w:val="32"/>
           <w:u w:val="single"/>
         </w:rPr>
-        <w:t>===========</w:t>
-      </w:r>
-      <w:r>
-        <w:rPr>
-          <w:b/>
-          <w:bCs/>
-          <w:sz w:val="32"/>
-          <w:szCs w:val="32"/>
-          <w:u w:val="single"/>
-        </w:rPr>
-        <w:br/>
-      </w:r>
-      <w:r>
-        <w:rPr>
-          <w:b/>
-          <w:bCs/>
-          <w:sz w:val="32"/>
-          <w:szCs w:val="32"/>
-          <w:u w:val="single"/>
-        </w:rPr>
+        <w:lastRenderedPageBreak/>
         <w:t xml:space="preserve">TS </w:t>
       </w:r>
       <w:r>
@@ -39727,7 +39764,6 @@
                 <w:sz w:val="28"/>
                 <w:szCs w:val="32"/>
               </w:rPr>
-              <w:lastRenderedPageBreak/>
               <w:t>None</w:t>
             </w:r>
           </w:p>

</xml_diff>